<commit_message>
Set v0.1 playtest objective and supply values
</commit_message>
<xml_diff>
--- a/docs/Historical_Battle_of_Tukayyid_Campaign_Rules.docx
+++ b/docs/Historical_Battle_of_Tukayyid_Campaign_Rules.docx
@@ -42,7 +42,7 @@
           <w:color w:val="566273"/>
           <w:sz w:val="24"/>
         </w:rPr>
-        <w:t>Changes-Only Campaign Playtest Draft</w:t>
+        <w:t>Version 0.1 Playtest</w:t>
       </w:r>
     </w:p>
     <w:p>
@@ -72,7 +72,7 @@
         <w:jc w:val="center"/>
       </w:pPr>
       <w:r>
-        <w:t>All feedback is welcome, whether based on actual play or simply reviewing the rules. Feedback on balance, campaign pacing, clarity, and the values still marked for playtesting would be especially helpful.</w:t>
+        <w:t>All feedback is welcome, whether based on actual play or simply reviewing the rules. Feedback on balance, campaign pacing, clarity, Track objectives, and the campaign economy would be especially helpful.</w:t>
       </w:r>
     </w:p>
     <w:p>
@@ -4021,7 +4021,7 @@
         <w:t xml:space="preserve">Ramming Speed. </w:t>
       </w:r>
       <w:r>
-        <w:t>Add the Ramming Speed objective using its Draconis Reach procedure. Its Objective Point value is pending playtest assignment.</w:t>
+        <w:t>Add the Ramming Speed objective using its Draconis Reach procedure. It is worth 150 Objective Points.</w:t>
       </w:r>
     </w:p>
     <w:p>
@@ -4432,200 +4432,14 @@
         <w:t xml:space="preserve">Campaign Reward. </w:t>
       </w:r>
       <w:r>
-        <w:t>Award additional SP for recovered components. The SP value per component is pending playtest assignment.</w:t>
+        <w:t>Each component carried off the Attacker's home edge awards the Attacker 500 SP. This reward is in addition to the Track's normal Support Allocation.</w:t>
       </w:r>
-    </w:p>
-    <w:p>
-      <w:pPr>
-        <w:sectPr>
-          <w:type w:val="continuous"/>
-          <w:pgSz w:w="12240" w:h="15840"/>
-          <w:pgMar w:top="1123" w:right="979" w:bottom="936" w:left="979" w:header="864" w:footer="708" w:gutter="0"/>
-          <w:cols w:space="360" w:num="2" w:equalWidth="1"/>
-          <w:docGrid w:linePitch="360"/>
-        </w:sectPr>
-      </w:pPr>
-    </w:p>
-    <w:p>
-      <w:pPr>
-        <w:keepNext/>
-        <w:spacing w:before="200" w:after="160"/>
-        <w:shd w:fill="213854"/>
-      </w:pPr>
-      <w:r>
-        <w:rPr>
-          <w:rFonts w:ascii="Aptos Display" w:hAnsi="Aptos Display"/>
-          <w:b/>
-          <w:color w:val="FFFFFF"/>
-          <w:sz w:val="30"/>
-        </w:rPr>
-        <w:t>6  OPEN PLAYTEST VALUES</w:t>
-      </w:r>
-    </w:p>
-    <w:tbl>
-      <w:tblPr>
-        <w:tblStyle w:val="TableGrid"/>
-        <w:tblW w:type="dxa" w:w="10040"/>
-        <w:jc w:val="left"/>
-        <w:tblLayout w:type="fixed"/>
-        <w:tblLook w:firstColumn="1" w:firstRow="1" w:lastColumn="0" w:lastRow="0" w:noHBand="0" w:noVBand="1" w:val="04A0"/>
-        <w:tblInd w:type="dxa" w:w="120"/>
-        <w:tblLayout w:type="fixed"/>
-      </w:tblPr>
-      <w:tblGrid>
-        <w:gridCol w:w="5020"/>
-        <w:gridCol w:w="5020"/>
-      </w:tblGrid>
-      <w:tr>
-        <w:trPr>
-          <w:tblHeader w:val="true"/>
-        </w:trPr>
-        <w:tc>
-          <w:tcPr>
-            <w:tcW w:type="dxa" w:w="5020"/>
-            <w:shd w:fill="DCE3EE"/>
-            <w:tcMar>
-              <w:top w:w="80" w:type="dxa"/>
-              <w:start w:w="120" w:type="dxa"/>
-              <w:bottom w:w="80" w:type="dxa"/>
-              <w:end w:w="120" w:type="dxa"/>
-            </w:tcMar>
-            <w:vAlign w:val="center"/>
-          </w:tcPr>
-          <w:p>
-            <w:r>
-              <w:rPr>
-                <w:b/>
-                <w:color w:val="213854"/>
-              </w:rPr>
-              <w:t>Rule</w:t>
-            </w:r>
-          </w:p>
-        </w:tc>
-        <w:tc>
-          <w:tcPr>
-            <w:tcW w:type="dxa" w:w="5020"/>
-            <w:shd w:fill="DCE3EE"/>
-            <w:tcMar>
-              <w:top w:w="80" w:type="dxa"/>
-              <w:start w:w="120" w:type="dxa"/>
-              <w:bottom w:w="80" w:type="dxa"/>
-              <w:end w:w="120" w:type="dxa"/>
-            </w:tcMar>
-            <w:vAlign w:val="center"/>
-          </w:tcPr>
-          <w:p>
-            <w:r>
-              <w:rPr>
-                <w:b/>
-                <w:color w:val="213854"/>
-              </w:rPr>
-              <w:t>Value Still Required</w:t>
-            </w:r>
-          </w:p>
-        </w:tc>
-      </w:tr>
-      <w:tr>
-        <w:trPr>
-          <w:cantSplit/>
-        </w:trPr>
-        <w:tc>
-          <w:tcPr>
-            <w:tcW w:type="dxa" w:w="5020"/>
-            <w:tcMar>
-              <w:top w:w="80" w:type="dxa"/>
-              <w:start w:w="120" w:type="dxa"/>
-              <w:bottom w:w="80" w:type="dxa"/>
-              <w:end w:w="120" w:type="dxa"/>
-            </w:tcMar>
-            <w:vAlign w:val="top"/>
-          </w:tcPr>
-          <w:p>
-            <w:pPr>
-              <w:spacing w:after="0"/>
-            </w:pPr>
-            <w:r>
-              <w:t>Flank — Ramming Speed</w:t>
-            </w:r>
-          </w:p>
-        </w:tc>
-        <w:tc>
-          <w:tcPr>
-            <w:tcW w:type="dxa" w:w="5020"/>
-            <w:tcMar>
-              <w:top w:w="80" w:type="dxa"/>
-              <w:start w:w="120" w:type="dxa"/>
-              <w:bottom w:w="80" w:type="dxa"/>
-              <w:end w:w="120" w:type="dxa"/>
-            </w:tcMar>
-            <w:vAlign w:val="top"/>
-          </w:tcPr>
-          <w:p>
-            <w:pPr>
-              <w:spacing w:after="0"/>
-            </w:pPr>
-            <w:r>
-              <w:t>Objective Point value</w:t>
-            </w:r>
-          </w:p>
-        </w:tc>
-      </w:tr>
-      <w:tr>
-        <w:trPr>
-          <w:cantSplit/>
-        </w:trPr>
-        <w:tc>
-          <w:tcPr>
-            <w:tcW w:type="dxa" w:w="5020"/>
-            <w:tcMar>
-              <w:top w:w="80" w:type="dxa"/>
-              <w:start w:w="120" w:type="dxa"/>
-              <w:bottom w:w="80" w:type="dxa"/>
-              <w:end w:w="120" w:type="dxa"/>
-            </w:tcMar>
-            <w:vAlign w:val="top"/>
-          </w:tcPr>
-          <w:p>
-            <w:pPr>
-              <w:spacing w:after="0"/>
-            </w:pPr>
-            <w:r>
-              <w:t>Supply — recovered components</w:t>
-            </w:r>
-          </w:p>
-        </w:tc>
-        <w:tc>
-          <w:tcPr>
-            <w:tcW w:type="dxa" w:w="5020"/>
-            <w:tcMar>
-              <w:top w:w="80" w:type="dxa"/>
-              <w:start w:w="120" w:type="dxa"/>
-              <w:bottom w:w="80" w:type="dxa"/>
-              <w:end w:w="120" w:type="dxa"/>
-            </w:tcMar>
-            <w:vAlign w:val="top"/>
-          </w:tcPr>
-          <w:p>
-            <w:pPr>
-              <w:spacing w:after="0"/>
-            </w:pPr>
-            <w:r>
-              <w:t>SP awarded per recovered component</w:t>
-            </w:r>
-          </w:p>
-        </w:tc>
-      </w:tr>
-    </w:tbl>
-    <w:p>
-      <w:pPr>
-        <w:spacing w:after="40"/>
-      </w:pPr>
     </w:p>
     <w:sectPr>
       <w:type w:val="continuous"/>
       <w:pgSz w:w="12240" w:h="15840"/>
       <w:pgMar w:top="1123" w:right="979" w:bottom="936" w:left="979" w:header="864" w:footer="708" w:gutter="0"/>
-      <w:cols w:space="360" w:num="1" w:equalWidth="1"/>
+      <w:cols w:space="360" w:num="2" w:equalWidth="1"/>
       <w:docGrid w:linePitch="360"/>
     </w:sectPr>
   </w:body>

</xml_diff>

<commit_message>
Correct required publication paths
</commit_message>
<xml_diff>
--- a/docs/Historical_Battle_of_Tukayyid_Campaign_Rules.docx
+++ b/docs/Historical_Battle_of_Tukayyid_Campaign_Rules.docx
@@ -55,7 +55,7 @@
         <w:jc w:val="center"/>
       </w:pPr>
       <w:r>
-        <w:t>This is a work-in-progress update to the Battle of Tukayyid campaign system. It retains the original campaign's structure and character while incorporating selected rules and concepts from the Core Rulebook and Hot Spots: Draconis Reach.</w:t>
+        <w:t>This is a work-in-progress update to the Battle of Tukayyid campaign system. It retains the original campaign's structure and character while incorporating selected rules and concepts from the BattleTech Core Rulebook and Hot Spots: Draconis Reach.</w:t>
       </w:r>
     </w:p>
     <w:p>
@@ -63,7 +63,7 @@
         <w:jc w:val="center"/>
       </w:pPr>
       <w:r>
-        <w:t>Only changed or additional rules are presented below. Unless specifically stated otherwise, continue using the published Battle of Tukayyid, Core Rulebook, and Hot Spots: Draconis Reach rules.</w:t>
+        <w:t>Only changed or additional rules are presented below. Unless specifically stated otherwise, continue using the published Battle of Tukayyid and Hot Spots: Draconis Reach rules, together with either the BattleTech Core Rulebook or Total Warfare and BattleTech: Mercenaries.</w:t>
       </w:r>
     </w:p>
     <w:p>
@@ -137,9 +137,8 @@
         <w:tblLayout w:type="fixed"/>
       </w:tblPr>
       <w:tblGrid>
-        <w:gridCol w:w="3347"/>
-        <w:gridCol w:w="3347"/>
-        <w:gridCol w:w="3346"/>
+        <w:gridCol w:w="3426"/>
+        <w:gridCol w:w="6614"/>
       </w:tblGrid>
       <w:tr>
         <w:trPr>
@@ -147,7 +146,7 @@
         </w:trPr>
         <w:tc>
           <w:tcPr>
-            <w:tcW w:type="dxa" w:w="3347"/>
+            <w:tcW w:type="dxa" w:w="3426"/>
             <w:shd w:fill="DCE3EE"/>
             <w:tcMar>
               <w:top w:w="80" w:type="dxa"/>
@@ -163,13 +162,13 @@
                 <w:b/>
                 <w:color w:val="213854"/>
               </w:rPr>
-              <w:t>Rules Base</w:t>
+              <w:t>Rules Path</w:t>
             </w:r>
           </w:p>
         </w:tc>
         <w:tc>
           <w:tcPr>
-            <w:tcW w:type="dxa" w:w="3347"/>
+            <w:tcW w:type="dxa" w:w="6614"/>
             <w:shd w:fill="DCE3EE"/>
             <w:tcMar>
               <w:top w:w="80" w:type="dxa"/>
@@ -185,29 +184,7 @@
                 <w:b/>
                 <w:color w:val="213854"/>
               </w:rPr>
-              <w:t>Campaign Frame</w:t>
-            </w:r>
-          </w:p>
-        </w:tc>
-        <w:tc>
-          <w:tcPr>
-            <w:tcW w:type="dxa" w:w="3346"/>
-            <w:shd w:fill="DCE3EE"/>
-            <w:tcMar>
-              <w:top w:w="80" w:type="dxa"/>
-              <w:start w:w="120" w:type="dxa"/>
-              <w:bottom w:w="80" w:type="dxa"/>
-              <w:end w:w="120" w:type="dxa"/>
-            </w:tcMar>
-            <w:vAlign w:val="center"/>
-          </w:tcPr>
-          <w:p>
-            <w:r>
-              <w:rPr>
-                <w:b/>
-                <w:color w:val="213854"/>
-              </w:rPr>
-              <w:t>Modernization Source</w:t>
+              <w:t>Required Publications</w:t>
             </w:r>
           </w:p>
         </w:tc>
@@ -218,7 +195,7 @@
         </w:trPr>
         <w:tc>
           <w:tcPr>
-            <w:tcW w:type="dxa" w:w="3347"/>
+            <w:tcW w:type="dxa" w:w="3426"/>
             <w:tcMar>
               <w:top w:w="80" w:type="dxa"/>
               <w:start w:w="120" w:type="dxa"/>
@@ -232,13 +209,13 @@
               <w:spacing w:after="0"/>
             </w:pPr>
             <w:r>
-              <w:t>Core Rulebook</w:t>
+              <w:t>New core rules</w:t>
             </w:r>
           </w:p>
         </w:tc>
         <w:tc>
           <w:tcPr>
-            <w:tcW w:type="dxa" w:w="3347"/>
+            <w:tcW w:type="dxa" w:w="6614"/>
             <w:tcMar>
               <w:top w:w="80" w:type="dxa"/>
               <w:start w:w="120" w:type="dxa"/>
@@ -252,13 +229,18 @@
               <w:spacing w:after="0"/>
             </w:pPr>
             <w:r>
-              <w:t>Battle of Tukayyid</w:t>
+              <w:t>BattleTech Core Rulebook</w:t>
             </w:r>
           </w:p>
         </w:tc>
+      </w:tr>
+      <w:tr>
+        <w:trPr>
+          <w:cantSplit/>
+        </w:trPr>
         <w:tc>
           <w:tcPr>
-            <w:tcW w:type="dxa" w:w="3346"/>
+            <w:tcW w:type="dxa" w:w="3426"/>
             <w:tcMar>
               <w:top w:w="80" w:type="dxa"/>
               <w:start w:w="120" w:type="dxa"/>
@@ -272,7 +254,72 @@
               <w:spacing w:after="0"/>
             </w:pPr>
             <w:r>
-              <w:t>Hot Spots: Draconis Reach</w:t>
+              <w:t>Alternative older rules</w:t>
+            </w:r>
+          </w:p>
+        </w:tc>
+        <w:tc>
+          <w:tcPr>
+            <w:tcW w:type="dxa" w:w="6614"/>
+            <w:tcMar>
+              <w:top w:w="80" w:type="dxa"/>
+              <w:start w:w="120" w:type="dxa"/>
+              <w:bottom w:w="80" w:type="dxa"/>
+              <w:end w:w="120" w:type="dxa"/>
+            </w:tcMar>
+            <w:vAlign w:val="top"/>
+          </w:tcPr>
+          <w:p>
+            <w:pPr>
+              <w:spacing w:after="0"/>
+            </w:pPr>
+            <w:r>
+              <w:t>Total Warfare and BattleTech: Mercenaries</w:t>
+            </w:r>
+          </w:p>
+        </w:tc>
+      </w:tr>
+      <w:tr>
+        <w:trPr>
+          <w:cantSplit/>
+        </w:trPr>
+        <w:tc>
+          <w:tcPr>
+            <w:tcW w:type="dxa" w:w="3426"/>
+            <w:tcMar>
+              <w:top w:w="80" w:type="dxa"/>
+              <w:start w:w="120" w:type="dxa"/>
+              <w:bottom w:w="80" w:type="dxa"/>
+              <w:end w:w="120" w:type="dxa"/>
+            </w:tcMar>
+            <w:vAlign w:val="top"/>
+          </w:tcPr>
+          <w:p>
+            <w:pPr>
+              <w:spacing w:after="0"/>
+            </w:pPr>
+            <w:r>
+              <w:t>Required with either path</w:t>
+            </w:r>
+          </w:p>
+        </w:tc>
+        <w:tc>
+          <w:tcPr>
+            <w:tcW w:type="dxa" w:w="6614"/>
+            <w:tcMar>
+              <w:top w:w="80" w:type="dxa"/>
+              <w:start w:w="120" w:type="dxa"/>
+              <w:bottom w:w="80" w:type="dxa"/>
+              <w:end w:w="120" w:type="dxa"/>
+            </w:tcMar>
+            <w:vAlign w:val="top"/>
+          </w:tcPr>
+          <w:p>
+            <w:pPr>
+              <w:spacing w:after="0"/>
+            </w:pPr>
+            <w:r>
+              <w:t>Battle of Tukayyid and Hot Spots: Draconis Reach</w:t>
             </w:r>
           </w:p>
         </w:tc>
@@ -292,7 +339,7 @@
         <w:t xml:space="preserve">Using These Rules. </w:t>
       </w:r>
       <w:r>
-        <w:t>This document changes, replaces, or adds to the published campaign rules. Any Battle of Tukayyid, Core Rulebook, or Hot Spots: Draconis Reach rule not addressed here remains in effect.</w:t>
+        <w:t>This document changes, replaces, or adds to the published campaign rules. Use either the BattleTech Core Rulebook or the combination of Total Warfare and BattleTech: Mercenaries for the core game and Battlefield Support rules. Battle of Tukayyid and Hot Spots: Draconis Reach are required with either rules path. Any applicable published rule not addressed here remains in effect.</w:t>
       </w:r>
     </w:p>
     <w:p>

</xml_diff>